<commit_message>
Deploying to gh-pages from @ Aaron-Tawil/aaron-tawil.github.io@3df2542072b27f6debd5fe5fba9e28a0c2cbaaa3 🚀
</commit_message>
<xml_diff>
--- a/cv/Aaron Tawil CV.docx
+++ b/cv/Aaron Tawil CV.docx
@@ -313,7 +313,7 @@
     </w:p>
     <w:p>
       <w:pPr>
-        <w:spacing w:line="240" w:lineRule="auto"/>
+        <w:spacing w:after="0" w:line="240" w:lineRule="auto"/>
         <w:rPr>
           <w:rFonts w:ascii="Arial" w:eastAsia="Times New Roman" w:hAnsi="Arial" w:cs="Arial"/>
           <w:color w:val="000000"/>
@@ -397,15 +397,14 @@
     </w:p>
     <w:p>
       <w:pPr>
-        <w:spacing w:after="0" w:line="240" w:lineRule="auto"/>
-        <w:jc w:val="both"/>
-        <w:textAlignment w:val="baseline"/>
-        <w:rPr>
-          <w:rFonts w:ascii="Arial" w:eastAsia="Times New Roman" w:hAnsi="Arial" w:cs="Arial"/>
-          <w:color w:val="000000"/>
-          <w:kern w:val="0"/>
-          <w:sz w:val="22"/>
-          <w:szCs w:val="22"/>
+        <w:spacing w:line="240" w:lineRule="auto"/>
+        <w:rPr>
+          <w:rFonts w:ascii="Arial" w:eastAsia="Times New Roman" w:hAnsi="Arial" w:cs="Arial"/>
+          <w:color w:val="000000"/>
+          <w:kern w:val="0"/>
+          <w:sz w:val="22"/>
+          <w:szCs w:val="22"/>
+          <w:u w:val="single"/>
           <w:lang w:val="en-US"/>
           <w14:ligatures w14:val="none"/>
         </w:rPr>
@@ -555,18 +554,6 @@
           <w:kern w:val="0"/>
           <w:sz w:val="22"/>
           <w:szCs w:val="22"/>
-          <w:lang w:val="en-US"/>
-          <w14:ligatures w14:val="none"/>
-        </w:rPr>
-        <w:br/>
-      </w:r>
-      <w:r>
-        <w:rPr>
-          <w:rFonts w:ascii="Arial" w:eastAsia="Times New Roman" w:hAnsi="Arial" w:cs="Arial"/>
-          <w:color w:val="000000"/>
-          <w:kern w:val="0"/>
-          <w:sz w:val="22"/>
-          <w:szCs w:val="22"/>
           <w:u w:val="single"/>
           <w14:ligatures w14:val="none"/>
         </w:rPr>
@@ -829,15 +816,16 @@
       </w:r>
       <w:r>
         <w:rPr>
-          <w:rFonts w:ascii="Arial" w:eastAsia="Times New Roman" w:hAnsi="Arial" w:cs="Arial"/>
-          <w:color w:val="000000"/>
-          <w:kern w:val="0"/>
-          <w:sz w:val="22"/>
-          <w:szCs w:val="22"/>
-          <w:lang w:val="en-US"/>
-          <w14:ligatures w14:val="none"/>
-        </w:rPr>
-        <w:t>87</w:t>
+          <w:rFonts w:ascii="Arial" w:eastAsia="Times New Roman" w:hAnsi="Arial" w:cs="Arial" w:hint="cs"/>
+          <w:color w:val="000000"/>
+          <w:kern w:val="0"/>
+          <w:sz w:val="22"/>
+          <w:szCs w:val="22"/>
+          <w:rtl/>
+          <w:lang w:val="en-US"/>
+          <w14:ligatures w14:val="none"/>
+        </w:rPr>
+        <w:t>89</w:t>
       </w:r>
     </w:p>
     <w:p>
@@ -1020,7 +1008,31 @@
           <w:szCs w:val="22"/>
           <w14:ligatures w14:val="none"/>
         </w:rPr>
-        <w:t>Algorithms – In Progress</w:t>
+        <w:t xml:space="preserve">Algorithms – </w:t>
+      </w:r>
+      <w:r>
+        <w:rPr>
+          <w:rFonts w:ascii="Arial" w:eastAsia="Times New Roman" w:hAnsi="Arial" w:cs="Arial" w:hint="cs"/>
+          <w:color w:val="000000"/>
+          <w:kern w:val="0"/>
+          <w:sz w:val="22"/>
+          <w:szCs w:val="22"/>
+          <w:rtl/>
+          <w14:ligatures w14:val="none"/>
+        </w:rPr>
+        <w:t>86</w:t>
+      </w:r>
+      <w:r>
+        <w:rPr>
+          <w:rFonts w:ascii="Arial" w:eastAsia="Times New Roman" w:hAnsi="Arial" w:cs="Arial"/>
+          <w:color w:val="000000"/>
+          <w:kern w:val="0"/>
+          <w:sz w:val="22"/>
+          <w:szCs w:val="22"/>
+          <w:lang w:val="en-US"/>
+          <w14:ligatures w14:val="none"/>
+        </w:rPr>
+        <w:t xml:space="preserve"> </w:t>
       </w:r>
     </w:p>
     <w:p>
@@ -1051,6 +1063,10 @@
     </w:p>
     <w:p>
       <w:pPr>
+        <w:numPr>
+          <w:ilvl w:val="0"/>
+          <w:numId w:val="13"/>
+        </w:numPr>
         <w:spacing w:line="240" w:lineRule="auto"/>
         <w:rPr>
           <w:rFonts w:ascii="Arial" w:eastAsia="Times New Roman" w:hAnsi="Arial" w:cs="Arial"/>
@@ -1368,7 +1384,62 @@
           <w:szCs w:val="22"/>
           <w14:ligatures w14:val="none"/>
         </w:rPr>
-        <w:t>Schedule, Storage</w:t>
+        <w:t>Schedule</w:t>
+      </w:r>
+      <w:r>
+        <w:rPr>
+          <w:rFonts w:ascii="Arial" w:eastAsia="Times New Roman" w:hAnsi="Arial" w:cs="Arial"/>
+          <w:color w:val="000000"/>
+          <w:kern w:val="0"/>
+          <w:sz w:val="22"/>
+          <w:szCs w:val="22"/>
+          <w14:ligatures w14:val="none"/>
+        </w:rPr>
+        <w:t>r</w:t>
+      </w:r>
+      <w:r>
+        <w:rPr>
+          <w:rFonts w:ascii="Arial" w:eastAsia="Times New Roman" w:hAnsi="Arial" w:cs="Arial"/>
+          <w:color w:val="000000"/>
+          <w:kern w:val="0"/>
+          <w:sz w:val="22"/>
+          <w:szCs w:val="22"/>
+          <w14:ligatures w14:val="none"/>
+        </w:rPr>
+        <w:t>, Storage</w:t>
+      </w:r>
+      <w:r>
+        <w:rPr>
+          <w:rFonts w:ascii="Arial" w:eastAsia="Times New Roman" w:hAnsi="Arial" w:cs="Arial"/>
+          <w:color w:val="000000"/>
+          <w:kern w:val="0"/>
+          <w:sz w:val="22"/>
+          <w:szCs w:val="22"/>
+          <w14:ligatures w14:val="none"/>
+        </w:rPr>
+        <w:t>,</w:t>
+      </w:r>
+      <w:r>
+        <w:rPr>
+          <w:rFonts w:ascii="Roboto" w:eastAsia="Times New Roman" w:hAnsi="Roboto" w:cs="Times New Roman"/>
+          <w:color w:val="FFFFFF"/>
+          <w:spacing w:val="2"/>
+          <w:kern w:val="0"/>
+          <w:lang/>
+          <w14:ligatures w14:val="none"/>
+        </w:rPr>
+        <w:t xml:space="preserve"> </w:t>
+      </w:r>
+      <w:r>
+        <w:rPr>
+          <w:rFonts w:ascii="Arial" w:eastAsia="Times New Roman" w:hAnsi="Arial" w:cs="Arial"/>
+          <w:color w:val="000000"/>
+          <w:kern w:val="0"/>
+          <w:sz w:val="22"/>
+          <w:szCs w:val="22"/>
+          <w14:ligatures w14:val="none"/>
+        </w:rPr>
+        <w:t>Pub/Sub</w:t>
       </w:r>
       <w:r>
         <w:rPr>
@@ -1512,6 +1583,41 @@
           <w14:ligatures w14:val="none"/>
         </w:rPr>
         <w:t>)</w:t>
+      </w:r>
+      <w:r>
+        <w:rPr>
+          <w:rFonts w:ascii="Arial" w:eastAsia="Times New Roman" w:hAnsi="Arial" w:cs="Arial"/>
+          <w:color w:val="000000"/>
+          <w:kern w:val="0"/>
+          <w:sz w:val="22"/>
+          <w:szCs w:val="22"/>
+          <w14:ligatures w14:val="none"/>
+        </w:rPr>
+        <w:t xml:space="preserve"> </w:t>
+      </w:r>
+      <w:r>
+        <w:rPr>
+          <w:rFonts w:ascii="Arial" w:eastAsia="Times New Roman" w:hAnsi="Arial" w:cs="Arial"/>
+          <w:color w:val="000000"/>
+          <w:kern w:val="0"/>
+          <w:sz w:val="22"/>
+          <w:szCs w:val="22"/>
+          <w:lang w:val="en-US"/>
+          <w14:ligatures w14:val="none"/>
+        </w:rPr>
+        <w:t>| Gemini API</w:t>
+      </w:r>
+      <w:r>
+        <w:rPr>
+          <w:rFonts w:ascii="Arial" w:eastAsia="Times New Roman" w:hAnsi="Arial" w:cs="Arial"/>
+          <w:color w:val="000000"/>
+          <w:kern w:val="0"/>
+          <w:sz w:val="22"/>
+          <w:szCs w:val="22"/>
+          <w:lang w:val="en-US"/>
+          <w14:ligatures w14:val="none"/>
+        </w:rPr>
+        <w:t>.</w:t>
       </w:r>
     </w:p>
     <w:p>
@@ -1565,7 +1671,7 @@
           <w:szCs w:val="22"/>
           <w14:ligatures w14:val="none"/>
         </w:rPr>
-        <w:t>TAU Grade Notifier - Serverless grade alerts</w:t>
+        <w:t>Smart Shelf Labels – Automated Retail Signage</w:t>
       </w:r>
       <w:r>
         <w:rPr>
@@ -1606,6 +1712,247 @@
         <w:t xml:space="preserve">epo: </w:t>
       </w:r>
       <w:hyperlink r:id="rId11" w:history="1">
+        <w:r>
+          <w:rPr>
+            <w:rStyle w:val="Hyperlink"/>
+            <w:rFonts w:ascii="Arial" w:eastAsia="Times New Roman" w:hAnsi="Arial" w:cs="Arial"/>
+            <w:kern w:val="0"/>
+            <w:sz w:val="22"/>
+            <w:szCs w:val="22"/>
+            <w14:ligatures w14:val="none"/>
+          </w:rPr>
+          <w:t>Smart Shelf Labels</w:t>
+        </w:r>
+      </w:hyperlink>
+    </w:p>
+    <w:p>
+      <w:pPr>
+        <w:pStyle w:val="ListParagraph"/>
+        <w:numPr>
+          <w:ilvl w:val="0"/>
+          <w:numId w:val="11"/>
+        </w:numPr>
+        <w:spacing w:after="0" w:line="240" w:lineRule="auto"/>
+        <w:rPr>
+          <w:rFonts w:ascii="Arial" w:eastAsia="Times New Roman" w:hAnsi="Arial" w:cs="Arial"/>
+          <w:color w:val="000000"/>
+          <w:kern w:val="0"/>
+          <w:sz w:val="22"/>
+          <w:szCs w:val="22"/>
+          <w14:ligatures w14:val="none"/>
+        </w:rPr>
+      </w:pPr>
+      <w:r>
+        <w:rPr>
+          <w:rFonts w:ascii="Arial" w:eastAsia="Times New Roman" w:hAnsi="Arial" w:cs="Arial"/>
+          <w:b/>
+          <w:bCs/>
+          <w:color w:val="000000"/>
+          <w:kern w:val="0"/>
+          <w:sz w:val="22"/>
+          <w:szCs w:val="22"/>
+          <w14:ligatures w14:val="none"/>
+        </w:rPr>
+        <w:t>Purpose</w:t>
+      </w:r>
+      <w:r>
+        <w:rPr>
+          <w:rFonts w:ascii="Arial" w:eastAsia="Times New Roman" w:hAnsi="Arial" w:cs="Arial"/>
+          <w:color w:val="000000"/>
+          <w:kern w:val="0"/>
+          <w:sz w:val="22"/>
+          <w:szCs w:val="22"/>
+          <w14:ligatures w14:val="none"/>
+        </w:rPr>
+        <w:t xml:space="preserve">: </w:t>
+      </w:r>
+      <w:r>
+        <w:rPr>
+          <w:rFonts w:ascii="Arial" w:eastAsia="Times New Roman" w:hAnsi="Arial" w:cs="Arial"/>
+          <w:color w:val="000000"/>
+          <w:kern w:val="0"/>
+          <w:sz w:val="22"/>
+          <w:szCs w:val="22"/>
+          <w14:ligatures w14:val="none"/>
+        </w:rPr>
+        <w:t>Automates the generation of print-ready retail signage by monitoring Gmail for Excel-based product updates and using GenAI to standardize data.</w:t>
+      </w:r>
+    </w:p>
+    <w:p>
+      <w:pPr>
+        <w:pStyle w:val="ListParagraph"/>
+        <w:numPr>
+          <w:ilvl w:val="0"/>
+          <w:numId w:val="11"/>
+        </w:numPr>
+        <w:spacing w:after="0" w:line="240" w:lineRule="auto"/>
+        <w:rPr>
+          <w:rFonts w:ascii="Arial" w:eastAsia="Times New Roman" w:hAnsi="Arial" w:cs="Arial"/>
+          <w:color w:val="000000"/>
+          <w:kern w:val="0"/>
+          <w:sz w:val="22"/>
+          <w:szCs w:val="22"/>
+          <w:lang w:val="en-US"/>
+          <w14:ligatures w14:val="none"/>
+        </w:rPr>
+      </w:pPr>
+      <w:r>
+        <w:rPr>
+          <w:rFonts w:ascii="Arial" w:eastAsia="Times New Roman" w:hAnsi="Arial" w:cs="Arial"/>
+          <w:b/>
+          <w:bCs/>
+          <w:color w:val="000000"/>
+          <w:kern w:val="0"/>
+          <w:sz w:val="22"/>
+          <w:szCs w:val="22"/>
+          <w14:ligatures w14:val="none"/>
+        </w:rPr>
+        <w:t>Highlights</w:t>
+      </w:r>
+      <w:r>
+        <w:rPr>
+          <w:rFonts w:ascii="Arial" w:eastAsia="Times New Roman" w:hAnsi="Arial" w:cs="Arial"/>
+          <w:color w:val="000000"/>
+          <w:kern w:val="0"/>
+          <w:sz w:val="22"/>
+          <w:szCs w:val="22"/>
+          <w14:ligatures w14:val="none"/>
+        </w:rPr>
+        <w:t xml:space="preserve">: </w:t>
+      </w:r>
+      <w:r>
+        <w:rPr>
+          <w:rFonts w:ascii="Arial" w:eastAsia="Times New Roman" w:hAnsi="Arial" w:cs="Arial"/>
+          <w:color w:val="000000"/>
+          <w:kern w:val="0"/>
+          <w:sz w:val="22"/>
+          <w:szCs w:val="22"/>
+          <w14:ligatures w14:val="none"/>
+        </w:rPr>
+        <w:t>Serverless pipeline using Cloud Functions (Gen 2) and Pub/Sub; integrated Google Gemini to intelligently clean messy ERP names and fix Hebrew RTL formatting; utilizes Firestore for state management to ensure signs are only generated for new products or price changes.</w:t>
+      </w:r>
+    </w:p>
+    <w:p>
+      <w:pPr>
+        <w:pStyle w:val="ListParagraph"/>
+        <w:numPr>
+          <w:ilvl w:val="0"/>
+          <w:numId w:val="11"/>
+        </w:numPr>
+        <w:spacing w:after="0" w:line="240" w:lineRule="auto"/>
+        <w:rPr>
+          <w:rFonts w:ascii="Arial" w:eastAsia="Times New Roman" w:hAnsi="Arial" w:cs="Arial"/>
+          <w:color w:val="000000"/>
+          <w:kern w:val="0"/>
+          <w:sz w:val="22"/>
+          <w:szCs w:val="22"/>
+          <w:u w:val="single"/>
+          <w:lang w:val="en-US"/>
+          <w14:ligatures w14:val="none"/>
+        </w:rPr>
+      </w:pPr>
+      <w:r>
+        <w:rPr>
+          <w:rFonts w:ascii="Arial" w:eastAsia="Times New Roman" w:hAnsi="Arial" w:cs="Arial"/>
+          <w:b/>
+          <w:bCs/>
+          <w:color w:val="000000"/>
+          <w:kern w:val="0"/>
+          <w:sz w:val="22"/>
+          <w:szCs w:val="22"/>
+          <w:lang w:val="en-US"/>
+          <w14:ligatures w14:val="none"/>
+        </w:rPr>
+        <w:t>Stack</w:t>
+      </w:r>
+      <w:r>
+        <w:rPr>
+          <w:rFonts w:ascii="Arial" w:eastAsia="Times New Roman" w:hAnsi="Arial" w:cs="Arial"/>
+          <w:color w:val="000000"/>
+          <w:kern w:val="0"/>
+          <w:sz w:val="22"/>
+          <w:szCs w:val="22"/>
+          <w14:ligatures w14:val="none"/>
+        </w:rPr>
+        <w:t xml:space="preserve">: </w:t>
+      </w:r>
+      <w:r>
+        <w:rPr>
+          <w:rFonts w:ascii="Arial" w:eastAsia="Times New Roman" w:hAnsi="Arial" w:cs="Arial"/>
+          <w:color w:val="000000"/>
+          <w:kern w:val="0"/>
+          <w:sz w:val="22"/>
+          <w:szCs w:val="22"/>
+          <w14:ligatures w14:val="none"/>
+        </w:rPr>
+        <w:t>Python, GCP (Functions, Firestore, Pub/Sub, Gmail API), Gemini API, ReportLab, Pandas.</w:t>
+      </w:r>
+    </w:p>
+    <w:p>
+      <w:pPr>
+        <w:spacing w:after="0" w:line="240" w:lineRule="auto"/>
+        <w:rPr>
+          <w:rFonts w:ascii="Arial" w:eastAsia="Times New Roman" w:hAnsi="Arial" w:cs="Arial"/>
+          <w:color w:val="000000"/>
+          <w:kern w:val="0"/>
+          <w:sz w:val="22"/>
+          <w:szCs w:val="22"/>
+          <w:lang w:val="en-US"/>
+          <w14:ligatures w14:val="none"/>
+        </w:rPr>
+      </w:pPr>
+      <w:r>
+        <w:rPr>
+          <w:rFonts w:ascii="Arial" w:eastAsia="Times New Roman" w:hAnsi="Arial" w:cs="Arial"/>
+          <w:b/>
+          <w:bCs/>
+          <w:color w:val="000000"/>
+          <w:kern w:val="0"/>
+          <w:sz w:val="22"/>
+          <w:szCs w:val="22"/>
+          <w14:ligatures w14:val="none"/>
+        </w:rPr>
+        <w:t>TAU Grade Notifier - Serverless grade alerts</w:t>
+      </w:r>
+      <w:r>
+        <w:rPr>
+          <w:rFonts w:ascii="Arial" w:eastAsia="Times New Roman" w:hAnsi="Arial" w:cs="Arial"/>
+          <w:b/>
+          <w:bCs/>
+          <w:color w:val="000000"/>
+          <w:kern w:val="0"/>
+          <w:sz w:val="22"/>
+          <w:szCs w:val="22"/>
+          <w:lang w:val="en-US"/>
+          <w14:ligatures w14:val="none"/>
+        </w:rPr>
+        <w:t xml:space="preserve">; </w:t>
+      </w:r>
+      <w:r>
+        <w:rPr>
+          <w:rFonts w:ascii="Arial" w:eastAsia="Times New Roman" w:hAnsi="Arial" w:cs="Arial"/>
+          <w:color w:val="000000"/>
+          <w:kern w:val="0"/>
+          <w:sz w:val="22"/>
+          <w:szCs w:val="22"/>
+          <w:lang w:val="en-US"/>
+          <w14:ligatures w14:val="none"/>
+        </w:rPr>
+        <w:t>R</w:t>
+      </w:r>
+      <w:r>
+        <w:rPr>
+          <w:rFonts w:ascii="Arial" w:eastAsia="Times New Roman" w:hAnsi="Arial" w:cs="Arial"/>
+          <w:color w:val="000000"/>
+          <w:kern w:val="0"/>
+          <w:sz w:val="22"/>
+          <w:szCs w:val="22"/>
+          <w:lang w:val="en-US"/>
+          <w14:ligatures w14:val="none"/>
+        </w:rPr>
+        <w:t xml:space="preserve">epo: </w:t>
+      </w:r>
+      <w:hyperlink r:id="rId12" w:history="1">
         <w:r>
           <w:rPr>
             <w:rStyle w:val="Hyperlink"/>
@@ -1658,30 +2005,18 @@
           <w:szCs w:val="22"/>
           <w14:ligatures w14:val="none"/>
         </w:rPr>
-        <w:t xml:space="preserve">: Monitors TAU's student portal and pushes Telegram alerts the moment a grade (or exam notebook availability) </w:t>
-      </w:r>
-      <w:r>
-        <w:rPr>
-          <w:rFonts w:ascii="Arial" w:eastAsia="Times New Roman" w:hAnsi="Arial" w:cs="Arial"/>
-          <w:color w:val="000000"/>
-          <w:kern w:val="0"/>
-          <w:sz w:val="22"/>
-          <w:szCs w:val="22"/>
-          <w:lang w:val="en-US"/>
-          <w14:ligatures w14:val="none"/>
-        </w:rPr>
-        <w:t>is published</w:t>
-      </w:r>
-      <w:r>
-        <w:rPr>
-          <w:rFonts w:ascii="Arial" w:eastAsia="Times New Roman" w:hAnsi="Arial" w:cs="Arial"/>
-          <w:color w:val="000000"/>
-          <w:kern w:val="0"/>
-          <w:sz w:val="22"/>
-          <w:szCs w:val="22"/>
-          <w14:ligatures w14:val="none"/>
-        </w:rPr>
-        <w:t>.</w:t>
+        <w:t xml:space="preserve">: </w:t>
+      </w:r>
+      <w:r>
+        <w:rPr>
+          <w:rFonts w:ascii="Arial" w:eastAsia="Times New Roman" w:hAnsi="Arial" w:cs="Arial"/>
+          <w:color w:val="000000"/>
+          <w:kern w:val="0"/>
+          <w:sz w:val="22"/>
+          <w:szCs w:val="22"/>
+          <w14:ligatures w14:val="none"/>
+        </w:rPr>
+        <w:t>Monitors TAU's student portal for grade changes and delivers real-time Telegram alerts for grades or exam notebook availability.</w:t>
       </w:r>
     </w:p>
     <w:p>
@@ -1724,19 +2059,18 @@
           <w:szCs w:val="22"/>
           <w14:ligatures w14:val="none"/>
         </w:rPr>
-        <w:t>: Headless login + scrape with Playwright; JSON diffing with a persisted cache in Google Cloud Storage (prevents duplicate pings); Dockerized on Cloud Run and triggered by Cloud Scheduler (for example, every 10 minutes, Sun-Thu)</w:t>
-      </w:r>
-      <w:r>
-        <w:rPr>
-          <w:rFonts w:ascii="Arial" w:eastAsia="Times New Roman" w:hAnsi="Arial" w:cs="Arial"/>
-          <w:color w:val="000000"/>
-          <w:kern w:val="0"/>
-          <w:sz w:val="22"/>
-          <w:szCs w:val="22"/>
-          <w:lang w:val="en-US"/>
-          <w14:ligatures w14:val="none"/>
-        </w:rPr>
-        <w:t>.</w:t>
+        <w:t xml:space="preserve">: </w:t>
+      </w:r>
+      <w:r>
+        <w:rPr>
+          <w:rFonts w:ascii="Arial" w:eastAsia="Times New Roman" w:hAnsi="Arial" w:cs="Arial"/>
+          <w:color w:val="000000"/>
+          <w:kern w:val="0"/>
+          <w:sz w:val="22"/>
+          <w:szCs w:val="22"/>
+          <w14:ligatures w14:val="none"/>
+        </w:rPr>
+        <w:t>Engineered a dual-monitoring strategy combining direct IMS backend HTTP requests for efficiency with Playwright headless scraping for UI-resilient reliability; implemented JSON diffing with a persisted Google Cloud Storage cache to eliminate duplicate notifications; Dockerized and deployed on Google Cloud Run with Cloud Scheduler triggers for a fully automated, cost-effective serverless architecture.</w:t>
       </w:r>
     </w:p>
     <w:p>
@@ -1766,20 +2100,44 @@
           <w:kern w:val="0"/>
           <w:sz w:val="22"/>
           <w:szCs w:val="22"/>
-          <w14:ligatures w14:val="none"/>
-        </w:rPr>
-        <w:t>Technologies</w:t>
-      </w:r>
-      <w:r>
-        <w:rPr>
-          <w:rFonts w:ascii="Arial" w:eastAsia="Times New Roman" w:hAnsi="Arial" w:cs="Arial"/>
-          <w:color w:val="000000"/>
-          <w:kern w:val="0"/>
-          <w:sz w:val="22"/>
-          <w:szCs w:val="22"/>
-          <w14:ligatures w14:val="none"/>
-        </w:rPr>
-        <w:t>: Python, Playwright, Telegram Bot API, Docker, Google Cloud Run, Cloud Scheduler,</w:t>
+          <w:lang w:val="en-US"/>
+          <w14:ligatures w14:val="none"/>
+        </w:rPr>
+        <w:t>Stack</w:t>
+      </w:r>
+      <w:r>
+        <w:rPr>
+          <w:rFonts w:ascii="Arial" w:eastAsia="Times New Roman" w:hAnsi="Arial" w:cs="Arial"/>
+          <w:color w:val="000000"/>
+          <w:kern w:val="0"/>
+          <w:sz w:val="22"/>
+          <w:szCs w:val="22"/>
+          <w14:ligatures w14:val="none"/>
+        </w:rPr>
+        <w:t xml:space="preserve">: Python, Telegram Bot API, Docker, </w:t>
+      </w:r>
+      <w:r>
+        <w:rPr>
+          <w:rFonts w:ascii="Arial" w:eastAsia="Times New Roman" w:hAnsi="Arial" w:cs="Arial"/>
+          <w:color w:val="000000"/>
+          <w:kern w:val="0"/>
+          <w:sz w:val="22"/>
+          <w:szCs w:val="22"/>
+          <w:lang w:val="en-US"/>
+          <w14:ligatures w14:val="none"/>
+        </w:rPr>
+        <w:t>GCP(</w:t>
+      </w:r>
+      <w:r>
+        <w:rPr>
+          <w:rFonts w:ascii="Arial" w:eastAsia="Times New Roman" w:hAnsi="Arial" w:cs="Arial"/>
+          <w:color w:val="000000"/>
+          <w:kern w:val="0"/>
+          <w:sz w:val="22"/>
+          <w:szCs w:val="22"/>
+          <w14:ligatures w14:val="none"/>
+        </w:rPr>
+        <w:t>Cloud Run,</w:t>
       </w:r>
       <w:r>
         <w:rPr>
@@ -1802,7 +2160,77 @@
           <w:szCs w:val="22"/>
           <w14:ligatures w14:val="none"/>
         </w:rPr>
-        <w:t>Cloud Storage.</w:t>
+        <w:t>Scheduler,</w:t>
+      </w:r>
+      <w:r>
+        <w:rPr>
+          <w:rFonts w:ascii="Arial" w:eastAsia="Times New Roman" w:hAnsi="Arial" w:cs="Arial"/>
+          <w:color w:val="000000"/>
+          <w:kern w:val="0"/>
+          <w:sz w:val="22"/>
+          <w:szCs w:val="22"/>
+          <w:lang w:val="en-US"/>
+          <w14:ligatures w14:val="none"/>
+        </w:rPr>
+        <w:t xml:space="preserve"> </w:t>
+      </w:r>
+      <w:r>
+        <w:rPr>
+          <w:rFonts w:ascii="Arial" w:eastAsia="Times New Roman" w:hAnsi="Arial" w:cs="Arial"/>
+          <w:color w:val="000000"/>
+          <w:kern w:val="0"/>
+          <w:sz w:val="22"/>
+          <w:szCs w:val="22"/>
+          <w14:ligatures w14:val="none"/>
+        </w:rPr>
+        <w:t>Storage</w:t>
+      </w:r>
+      <w:r>
+        <w:rPr>
+          <w:rFonts w:ascii="Arial" w:eastAsia="Times New Roman" w:hAnsi="Arial" w:cs="Arial"/>
+          <w:color w:val="000000"/>
+          <w:kern w:val="0"/>
+          <w:sz w:val="22"/>
+          <w:szCs w:val="22"/>
+          <w:lang w:val="en-US"/>
+          <w14:ligatures w14:val="none"/>
+        </w:rPr>
+        <w:t>)</w:t>
+      </w:r>
+      <w:r>
+        <w:rPr>
+          <w:rFonts w:ascii="Arial" w:eastAsia="Times New Roman" w:hAnsi="Arial" w:cs="Arial"/>
+          <w:color w:val="000000"/>
+          <w:kern w:val="0"/>
+          <w:sz w:val="22"/>
+          <w:szCs w:val="22"/>
+          <w:lang w:val="en-US"/>
+          <w14:ligatures w14:val="none"/>
+        </w:rPr>
+        <w:t xml:space="preserve">, </w:t>
+      </w:r>
+      <w:r>
+        <w:rPr>
+          <w:rFonts w:ascii="Arial" w:eastAsia="Times New Roman" w:hAnsi="Arial" w:cs="Arial"/>
+          <w:color w:val="000000"/>
+          <w:kern w:val="0"/>
+          <w:sz w:val="22"/>
+          <w:szCs w:val="22"/>
+          <w14:ligatures w14:val="none"/>
+        </w:rPr>
+        <w:t>Playwright, Requests, BeautifulSoup</w:t>
+      </w:r>
+      <w:r>
+        <w:rPr>
+          <w:rFonts w:ascii="Arial" w:eastAsia="Times New Roman" w:hAnsi="Arial" w:cs="Arial"/>
+          <w:color w:val="000000"/>
+          <w:kern w:val="0"/>
+          <w:sz w:val="22"/>
+          <w:szCs w:val="22"/>
+          <w:lang w:val="en-US"/>
+          <w14:ligatures w14:val="none"/>
+        </w:rPr>
+        <w:t>.</w:t>
       </w:r>
     </w:p>
     <w:p>
@@ -1814,6 +2242,7 @@
           <w:kern w:val="0"/>
           <w:sz w:val="22"/>
           <w:szCs w:val="22"/>
+          <w:u w:val="single"/>
           <w:lang w:val="en-US"/>
           <w14:ligatures w14:val="none"/>
         </w:rPr>
@@ -1829,18 +2258,7 @@
           <w:szCs w:val="22"/>
           <w14:ligatures w14:val="none"/>
         </w:rPr>
-        <w:t>SymNMF Clustering</w:t>
-      </w:r>
-      <w:r>
-        <w:rPr>
-          <w:rFonts w:ascii="Arial" w:eastAsia="Times New Roman" w:hAnsi="Arial" w:cs="Arial"/>
-          <w:color w:val="000000"/>
-          <w:kern w:val="0"/>
-          <w:sz w:val="22"/>
-          <w:szCs w:val="22"/>
-          <w14:ligatures w14:val="none"/>
-        </w:rPr>
-        <w:t xml:space="preserve"> </w:t>
+        <w:t>Android App for Inventory Management with Barcode Scanner</w:t>
       </w:r>
       <w:r>
         <w:rPr>
@@ -1853,7 +2271,7 @@
           <w:szCs w:val="22"/>
           <w14:ligatures w14:val="none"/>
         </w:rPr>
-        <w:t>–</w:t>
+        <w:t xml:space="preserve"> (2020)</w:t>
       </w:r>
       <w:r>
         <w:rPr>
@@ -1864,10 +2282,181 @@
           <w:kern w:val="0"/>
           <w:sz w:val="22"/>
           <w:szCs w:val="22"/>
-          <w14:ligatures w14:val="none"/>
-        </w:rPr>
-        <w:t xml:space="preserve"> C</w:t>
-      </w:r>
+          <w:lang w:val="en-US"/>
+          <w14:ligatures w14:val="none"/>
+        </w:rPr>
+        <w:t xml:space="preserve">; </w:t>
+      </w:r>
+      <w:r>
+        <w:rPr>
+          <w:rFonts w:ascii="Arial" w:eastAsia="Times New Roman" w:hAnsi="Arial" w:cs="Arial"/>
+          <w:color w:val="000000"/>
+          <w:kern w:val="0"/>
+          <w:sz w:val="22"/>
+          <w:szCs w:val="22"/>
+          <w:lang w:val="en-US"/>
+          <w14:ligatures w14:val="none"/>
+        </w:rPr>
+        <w:t>R</w:t>
+      </w:r>
+      <w:r>
+        <w:rPr>
+          <w:rFonts w:ascii="Arial" w:eastAsia="Times New Roman" w:hAnsi="Arial" w:cs="Arial"/>
+          <w:color w:val="000000"/>
+          <w:kern w:val="0"/>
+          <w:sz w:val="22"/>
+          <w:szCs w:val="22"/>
+          <w:lang w:val="en-US"/>
+          <w14:ligatures w14:val="none"/>
+        </w:rPr>
+        <w:t>epo</w:t>
+      </w:r>
+      <w:r>
+        <w:rPr>
+          <w:rFonts w:ascii="Arial" w:eastAsia="Times New Roman" w:hAnsi="Arial" w:cs="Arial"/>
+          <w:color w:val="000000"/>
+          <w:kern w:val="0"/>
+          <w:sz w:val="22"/>
+          <w:szCs w:val="22"/>
+          <w:lang w:val="en-US"/>
+          <w14:ligatures w14:val="none"/>
+        </w:rPr>
+        <w:t xml:space="preserve">: </w:t>
+      </w:r>
+      <w:hyperlink r:id="rId13" w:history="1">
+        <w:r>
+          <w:rPr>
+            <w:rStyle w:val="Hyperlink"/>
+            <w:rFonts w:ascii="Arial" w:eastAsia="Times New Roman" w:hAnsi="Arial" w:cs="Arial"/>
+            <w:kern w:val="0"/>
+            <w:sz w:val="22"/>
+            <w:szCs w:val="22"/>
+            <w:lang w:val="en-US"/>
+            <w14:ligatures w14:val="none"/>
+          </w:rPr>
+          <w:t>Barcode Scan</w:t>
+        </w:r>
+      </w:hyperlink>
+    </w:p>
+    <w:p>
+      <w:pPr>
+        <w:numPr>
+          <w:ilvl w:val="0"/>
+          <w:numId w:val="8"/>
+        </w:numPr>
+        <w:spacing w:after="0" w:line="240" w:lineRule="auto"/>
+        <w:rPr>
+          <w:rFonts w:ascii="Arial" w:eastAsia="Times New Roman" w:hAnsi="Arial" w:cs="Arial"/>
+          <w:color w:val="000000"/>
+          <w:kern w:val="0"/>
+          <w:sz w:val="22"/>
+          <w:szCs w:val="22"/>
+          <w14:ligatures w14:val="none"/>
+        </w:rPr>
+      </w:pPr>
+      <w:r>
+        <w:rPr>
+          <w:rFonts w:ascii="Arial" w:eastAsia="Times New Roman" w:hAnsi="Arial" w:cs="Arial"/>
+          <w:color w:val="000000"/>
+          <w:kern w:val="0"/>
+          <w:sz w:val="22"/>
+          <w:szCs w:val="22"/>
+          <w14:ligatures w14:val="none"/>
+        </w:rPr>
+        <w:t>Developed an Android app in Kotlin to retrieve item details (price, quantity</w:t>
+      </w:r>
+      <w:r>
+        <w:rPr>
+          <w:rFonts w:ascii="Arial" w:eastAsia="Times New Roman" w:hAnsi="Arial" w:cs="Arial"/>
+          <w:color w:val="000000"/>
+          <w:kern w:val="0"/>
+          <w:sz w:val="22"/>
+          <w:szCs w:val="22"/>
+          <w14:ligatures w14:val="none"/>
+        </w:rPr>
+        <w:t>, etc.</w:t>
+      </w:r>
+      <w:r>
+        <w:rPr>
+          <w:rFonts w:ascii="Arial" w:eastAsia="Times New Roman" w:hAnsi="Arial" w:cs="Arial"/>
+          <w:color w:val="000000"/>
+          <w:kern w:val="0"/>
+          <w:sz w:val="22"/>
+          <w:szCs w:val="22"/>
+          <w14:ligatures w14:val="none"/>
+        </w:rPr>
+        <w:t>) via barcode scanning or manual search.</w:t>
+      </w:r>
+    </w:p>
+    <w:p>
+      <w:pPr>
+        <w:numPr>
+          <w:ilvl w:val="0"/>
+          <w:numId w:val="8"/>
+        </w:numPr>
+        <w:spacing w:after="0" w:line="240" w:lineRule="auto"/>
+        <w:rPr>
+          <w:rFonts w:ascii="Arial" w:eastAsia="Times New Roman" w:hAnsi="Arial" w:cs="Arial"/>
+          <w:color w:val="000000"/>
+          <w:kern w:val="0"/>
+          <w:sz w:val="22"/>
+          <w:szCs w:val="22"/>
+          <w14:ligatures w14:val="none"/>
+        </w:rPr>
+      </w:pPr>
+      <w:r>
+        <w:rPr>
+          <w:rFonts w:ascii="Arial" w:eastAsia="Times New Roman" w:hAnsi="Arial" w:cs="Arial"/>
+          <w:color w:val="000000"/>
+          <w:kern w:val="0"/>
+          <w:sz w:val="22"/>
+          <w:szCs w:val="22"/>
+          <w14:ligatures w14:val="none"/>
+        </w:rPr>
+        <w:t>Boosted employee productivity (~20% faster in receiving new goods).</w:t>
+      </w:r>
+    </w:p>
+    <w:p>
+      <w:pPr>
+        <w:numPr>
+          <w:ilvl w:val="0"/>
+          <w:numId w:val="8"/>
+        </w:numPr>
+        <w:spacing w:after="0" w:line="240" w:lineRule="auto"/>
+        <w:rPr>
+          <w:rFonts w:ascii="Arial" w:eastAsia="Times New Roman" w:hAnsi="Arial" w:cs="Arial"/>
+          <w:color w:val="000000"/>
+          <w:kern w:val="0"/>
+          <w:sz w:val="22"/>
+          <w:szCs w:val="22"/>
+          <w14:ligatures w14:val="none"/>
+        </w:rPr>
+      </w:pPr>
+      <w:r>
+        <w:rPr>
+          <w:rFonts w:ascii="Arial" w:eastAsia="Times New Roman" w:hAnsi="Arial" w:cs="Arial"/>
+          <w:color w:val="000000"/>
+          <w:kern w:val="0"/>
+          <w:sz w:val="22"/>
+          <w:szCs w:val="22"/>
+          <w14:ligatures w14:val="none"/>
+        </w:rPr>
+        <w:t>Integrated with Firebase for cloud sync and Room for local data storage.</w:t>
+      </w:r>
+    </w:p>
+    <w:p>
+      <w:pPr>
+        <w:spacing w:after="0" w:line="240" w:lineRule="auto"/>
+        <w:rPr>
+          <w:rFonts w:ascii="Arial" w:eastAsia="Times New Roman" w:hAnsi="Arial" w:cs="Arial"/>
+          <w:color w:val="000000"/>
+          <w:kern w:val="0"/>
+          <w:sz w:val="22"/>
+          <w:szCs w:val="22"/>
+          <w:lang w:val="en-US"/>
+          <w14:ligatures w14:val="none"/>
+        </w:rPr>
+      </w:pPr>
       <w:r>
         <w:rPr>
           <w:rFonts w:ascii="Arial" w:eastAsia="Times New Roman" w:hAnsi="Arial" w:cs="Arial"/>
@@ -1877,10 +2466,20 @@
           <w:kern w:val="0"/>
           <w:sz w:val="22"/>
           <w:szCs w:val="22"/>
-          <w:lang w:val="en-US"/>
-          <w14:ligatures w14:val="none"/>
-        </w:rPr>
-        <w:t>-A</w:t>
+          <w14:ligatures w14:val="none"/>
+        </w:rPr>
+        <w:t>SymNMF Clustering</w:t>
+      </w:r>
+      <w:r>
+        <w:rPr>
+          <w:rFonts w:ascii="Arial" w:eastAsia="Times New Roman" w:hAnsi="Arial" w:cs="Arial"/>
+          <w:color w:val="000000"/>
+          <w:kern w:val="0"/>
+          <w:sz w:val="22"/>
+          <w:szCs w:val="22"/>
+          <w14:ligatures w14:val="none"/>
+        </w:rPr>
+        <w:t xml:space="preserve"> </w:t>
       </w:r>
       <w:r>
         <w:rPr>
@@ -1893,19 +2492,7 @@
           <w:szCs w:val="22"/>
           <w14:ligatures w14:val="none"/>
         </w:rPr>
-        <w:t>ccelerated ML</w:t>
-      </w:r>
-      <w:r>
-        <w:rPr>
-          <w:rFonts w:ascii="Arial" w:eastAsia="Times New Roman" w:hAnsi="Arial" w:cs="Arial"/>
-          <w:color w:val="000000"/>
-          <w:kern w:val="0"/>
-          <w:sz w:val="22"/>
-          <w:szCs w:val="22"/>
-          <w:lang w:val="en-US"/>
-          <w14:ligatures w14:val="none"/>
-        </w:rPr>
-        <w:t xml:space="preserve"> </w:t>
+        <w:t>–</w:t>
       </w:r>
       <w:r>
         <w:rPr>
@@ -1916,34 +2503,9 @@
           <w:kern w:val="0"/>
           <w:sz w:val="22"/>
           <w:szCs w:val="22"/>
-          <w:lang w:val="en-US"/>
-          <w14:ligatures w14:val="none"/>
-        </w:rPr>
-        <w:t>Algorithm</w:t>
-      </w:r>
-      <w:r>
-        <w:rPr>
-          <w:rFonts w:ascii="Arial" w:eastAsia="Times New Roman" w:hAnsi="Arial" w:cs="Arial"/>
-          <w:color w:val="000000"/>
-          <w:kern w:val="0"/>
-          <w:sz w:val="22"/>
-          <w:szCs w:val="22"/>
-          <w:lang w:val="en-US"/>
-          <w14:ligatures w14:val="none"/>
-        </w:rPr>
-        <w:t xml:space="preserve"> </w:t>
-      </w:r>
-      <w:r>
-        <w:rPr>
-          <w:rFonts w:ascii="Arial" w:eastAsia="Times New Roman" w:hAnsi="Arial" w:cs="Arial"/>
-          <w:color w:val="000000"/>
-          <w:kern w:val="0"/>
-          <w:sz w:val="22"/>
-          <w:szCs w:val="22"/>
-          <w:lang w:val="en-US"/>
-          <w14:ligatures w14:val="none"/>
-        </w:rPr>
-        <w:t xml:space="preserve"> </w:t>
+          <w14:ligatures w14:val="none"/>
+        </w:rPr>
+        <w:t xml:space="preserve"> C</w:t>
       </w:r>
       <w:r>
         <w:rPr>
@@ -1954,6 +2516,83 @@
           <w:kern w:val="0"/>
           <w:sz w:val="22"/>
           <w:szCs w:val="22"/>
+          <w:lang w:val="en-US"/>
+          <w14:ligatures w14:val="none"/>
+        </w:rPr>
+        <w:t>-A</w:t>
+      </w:r>
+      <w:r>
+        <w:rPr>
+          <w:rFonts w:ascii="Arial" w:eastAsia="Times New Roman" w:hAnsi="Arial" w:cs="Arial"/>
+          <w:b/>
+          <w:bCs/>
+          <w:color w:val="000000"/>
+          <w:kern w:val="0"/>
+          <w:sz w:val="22"/>
+          <w:szCs w:val="22"/>
+          <w14:ligatures w14:val="none"/>
+        </w:rPr>
+        <w:t>ccelerated ML</w:t>
+      </w:r>
+      <w:r>
+        <w:rPr>
+          <w:rFonts w:ascii="Arial" w:eastAsia="Times New Roman" w:hAnsi="Arial" w:cs="Arial"/>
+          <w:color w:val="000000"/>
+          <w:kern w:val="0"/>
+          <w:sz w:val="22"/>
+          <w:szCs w:val="22"/>
+          <w:lang w:val="en-US"/>
+          <w14:ligatures w14:val="none"/>
+        </w:rPr>
+        <w:t xml:space="preserve"> </w:t>
+      </w:r>
+      <w:r>
+        <w:rPr>
+          <w:rFonts w:ascii="Arial" w:eastAsia="Times New Roman" w:hAnsi="Arial" w:cs="Arial"/>
+          <w:b/>
+          <w:bCs/>
+          <w:color w:val="000000"/>
+          <w:kern w:val="0"/>
+          <w:sz w:val="22"/>
+          <w:szCs w:val="22"/>
+          <w:lang w:val="en-US"/>
+          <w14:ligatures w14:val="none"/>
+        </w:rPr>
+        <w:t>Algorithm</w:t>
+      </w:r>
+      <w:r>
+        <w:rPr>
+          <w:rFonts w:ascii="Arial" w:eastAsia="Times New Roman" w:hAnsi="Arial" w:cs="Arial"/>
+          <w:color w:val="000000"/>
+          <w:kern w:val="0"/>
+          <w:sz w:val="22"/>
+          <w:szCs w:val="22"/>
+          <w:lang w:val="en-US"/>
+          <w14:ligatures w14:val="none"/>
+        </w:rPr>
+        <w:t xml:space="preserve"> </w:t>
+      </w:r>
+      <w:r>
+        <w:rPr>
+          <w:rFonts w:ascii="Arial" w:eastAsia="Times New Roman" w:hAnsi="Arial" w:cs="Arial"/>
+          <w:color w:val="000000"/>
+          <w:kern w:val="0"/>
+          <w:sz w:val="22"/>
+          <w:szCs w:val="22"/>
+          <w:lang w:val="en-US"/>
+          <w14:ligatures w14:val="none"/>
+        </w:rPr>
+        <w:t xml:space="preserve"> </w:t>
+      </w:r>
+      <w:r>
+        <w:rPr>
+          <w:rFonts w:ascii="Arial" w:eastAsia="Times New Roman" w:hAnsi="Arial" w:cs="Arial"/>
+          <w:b/>
+          <w:bCs/>
+          <w:color w:val="000000"/>
+          <w:kern w:val="0"/>
+          <w:sz w:val="22"/>
+          <w:szCs w:val="22"/>
           <w14:ligatures w14:val="none"/>
         </w:rPr>
         <w:t>(University)</w:t>
@@ -1994,7 +2633,7 @@
         </w:rPr>
         <w:t xml:space="preserve">: </w:t>
       </w:r>
-      <w:hyperlink r:id="rId12" w:history="1">
+      <w:hyperlink r:id="rId14" w:history="1">
         <w:r>
           <w:rPr>
             <w:rStyle w:val="Hyperlink"/>
@@ -2089,9 +2728,10 @@
           <w:kern w:val="0"/>
           <w:sz w:val="22"/>
           <w:szCs w:val="22"/>
-          <w14:ligatures w14:val="none"/>
-        </w:rPr>
-        <w:t>Technologies</w:t>
+          <w:lang w:val="en-US"/>
+          <w14:ligatures w14:val="none"/>
+        </w:rPr>
+        <w:t>Stack</w:t>
       </w:r>
       <w:r>
         <w:rPr>
@@ -2203,7 +2843,7 @@
         </w:rPr>
         <w:t xml:space="preserve"> </w:t>
       </w:r>
-      <w:hyperlink r:id="rId13" w:history="1">
+      <w:hyperlink r:id="rId15" w:history="1">
         <w:r>
           <w:rPr>
             <w:rStyle w:val="Hyperlink"/>
@@ -2239,7 +2879,7 @@
         </w:rPr>
         <w:t xml:space="preserve">| </w:t>
       </w:r>
-      <w:hyperlink r:id="rId14" w:history="1">
+      <w:hyperlink r:id="rId16" w:history="1">
         <w:r>
           <w:rPr>
             <w:rStyle w:val="Hyperlink"/>
@@ -2342,25 +2982,30 @@
         </w:rPr>
         <w:t>with support for insertion, deletion, search, and advanced operations like split/join</w:t>
       </w:r>
-    </w:p>
-    <w:p>
-      <w:pPr>
-        <w:pStyle w:val="ListParagraph"/>
-        <w:numPr>
-          <w:ilvl w:val="0"/>
-          <w:numId w:val="10"/>
-        </w:numPr>
-        <w:spacing w:after="0" w:line="240" w:lineRule="auto"/>
-        <w:rPr>
-          <w:rFonts w:ascii="Arial" w:eastAsia="Times New Roman" w:hAnsi="Arial" w:cs="Arial"/>
-          <w:color w:val="000000"/>
-          <w:kern w:val="0"/>
-          <w:sz w:val="22"/>
-          <w:szCs w:val="22"/>
-          <w:lang w:val="en-US"/>
-          <w14:ligatures w14:val="none"/>
-        </w:rPr>
-      </w:pPr>
+      <w:r>
+        <w:rPr>
+          <w:rFonts w:ascii="Arial" w:eastAsia="Times New Roman" w:hAnsi="Arial" w:cs="Arial"/>
+          <w:color w:val="000000"/>
+          <w:kern w:val="0"/>
+          <w:sz w:val="22"/>
+          <w:szCs w:val="22"/>
+          <w:lang w:val="en-US"/>
+          <w14:ligatures w14:val="none"/>
+        </w:rPr>
+        <w:t xml:space="preserve">. </w:t>
+      </w:r>
+      <w:r>
+        <w:rPr>
+          <w:rFonts w:ascii="Arial" w:eastAsia="Times New Roman" w:hAnsi="Arial" w:cs="Arial"/>
+          <w:color w:val="000000"/>
+          <w:kern w:val="0"/>
+          <w:sz w:val="22"/>
+          <w:szCs w:val="22"/>
+          <w:lang w:val="en-US"/>
+          <w14:ligatures w14:val="none"/>
+        </w:rPr>
+        <w:t xml:space="preserve">| </w:t>
+      </w:r>
       <w:r>
         <w:rPr>
           <w:rFonts w:ascii="Arial" w:eastAsia="Times New Roman" w:hAnsi="Arial" w:cs="Arial"/>
@@ -2382,31 +3027,7 @@
           <w:lang w:val="en-US"/>
           <w14:ligatures w14:val="none"/>
         </w:rPr>
-        <w:t>J</w:t>
-      </w:r>
-      <w:r>
-        <w:rPr>
-          <w:rFonts w:ascii="Arial" w:eastAsia="Times New Roman" w:hAnsi="Arial" w:cs="Arial"/>
-          <w:color w:val="000000"/>
-          <w:kern w:val="0"/>
-          <w:sz w:val="22"/>
-          <w:szCs w:val="22"/>
-          <w:lang w:val="en-US"/>
-          <w14:ligatures w14:val="none"/>
-        </w:rPr>
-        <w:t>a</w:t>
-      </w:r>
-      <w:r>
-        <w:rPr>
-          <w:rFonts w:ascii="Arial" w:eastAsia="Times New Roman" w:hAnsi="Arial" w:cs="Arial"/>
-          <w:color w:val="000000"/>
-          <w:kern w:val="0"/>
-          <w:sz w:val="22"/>
-          <w:szCs w:val="22"/>
-          <w:lang w:val="en-US"/>
-          <w14:ligatures w14:val="none"/>
-        </w:rPr>
-        <w:t>va</w:t>
+        <w:t>Java</w:t>
       </w:r>
       <w:r>
         <w:rPr>
@@ -2440,265 +3061,20 @@
           <w:szCs w:val="22"/>
           <w14:ligatures w14:val="none"/>
         </w:rPr>
-        <w:t>developed a heap supporting efficient merges and key updates; applied to graph algorithms such as Dijkstra’s.</w:t>
-      </w:r>
-      <w:r>
-        <w:rPr>
-          <w:rFonts w:ascii="Arial" w:eastAsia="Times New Roman" w:hAnsi="Arial" w:cs="Arial"/>
-          <w:color w:val="000000"/>
-          <w:kern w:val="0"/>
-          <w:sz w:val="22"/>
-          <w:szCs w:val="22"/>
-          <w14:ligatures w14:val="none"/>
-        </w:rPr>
-        <w:t xml:space="preserve"> </w:t>
-      </w:r>
-    </w:p>
-    <w:p>
-      <w:pPr>
-        <w:spacing w:after="0" w:line="240" w:lineRule="auto"/>
-        <w:rPr>
-          <w:rFonts w:ascii="Arial" w:eastAsia="Times New Roman" w:hAnsi="Arial" w:cs="Arial"/>
-          <w:color w:val="000000"/>
-          <w:kern w:val="0"/>
-          <w:sz w:val="22"/>
-          <w:szCs w:val="22"/>
-          <w:u w:val="single"/>
-          <w:lang w:val="en-US"/>
-          <w14:ligatures w14:val="none"/>
-        </w:rPr>
-      </w:pPr>
-      <w:r>
-        <w:rPr>
-          <w:rFonts w:ascii="Arial" w:eastAsia="Times New Roman" w:hAnsi="Arial" w:cs="Arial"/>
-          <w:b/>
-          <w:bCs/>
-          <w:color w:val="000000"/>
-          <w:kern w:val="0"/>
-          <w:sz w:val="22"/>
-          <w:szCs w:val="22"/>
-          <w14:ligatures w14:val="none"/>
-        </w:rPr>
-        <w:t>Android App for Inventory Management with Barcode Scanner</w:t>
-      </w:r>
-      <w:r>
-        <w:rPr>
-          <w:rFonts w:ascii="Arial" w:eastAsia="Times New Roman" w:hAnsi="Arial" w:cs="Arial"/>
-          <w:b/>
-          <w:bCs/>
-          <w:color w:val="000000"/>
-          <w:kern w:val="0"/>
-          <w:sz w:val="22"/>
-          <w:szCs w:val="22"/>
-          <w14:ligatures w14:val="none"/>
-        </w:rPr>
-        <w:t xml:space="preserve"> (2020)</w:t>
-      </w:r>
-      <w:r>
-        <w:rPr>
-          <w:rFonts w:ascii="Arial" w:eastAsia="Times New Roman" w:hAnsi="Arial" w:cs="Arial"/>
-          <w:b/>
-          <w:bCs/>
-          <w:color w:val="000000"/>
-          <w:kern w:val="0"/>
-          <w:sz w:val="22"/>
-          <w:szCs w:val="22"/>
-          <w:lang w:val="en-US"/>
-          <w14:ligatures w14:val="none"/>
-        </w:rPr>
-        <w:t xml:space="preserve">; </w:t>
-      </w:r>
-      <w:r>
-        <w:rPr>
-          <w:rFonts w:ascii="Arial" w:eastAsia="Times New Roman" w:hAnsi="Arial" w:cs="Arial"/>
-          <w:color w:val="000000"/>
-          <w:kern w:val="0"/>
-          <w:sz w:val="22"/>
-          <w:szCs w:val="22"/>
-          <w:lang w:val="en-US"/>
-          <w14:ligatures w14:val="none"/>
-        </w:rPr>
-        <w:t>R</w:t>
-      </w:r>
-      <w:r>
-        <w:rPr>
-          <w:rFonts w:ascii="Arial" w:eastAsia="Times New Roman" w:hAnsi="Arial" w:cs="Arial"/>
-          <w:color w:val="000000"/>
-          <w:kern w:val="0"/>
-          <w:sz w:val="22"/>
-          <w:szCs w:val="22"/>
-          <w:lang w:val="en-US"/>
-          <w14:ligatures w14:val="none"/>
-        </w:rPr>
-        <w:t>epo</w:t>
-      </w:r>
-      <w:r>
-        <w:rPr>
-          <w:rFonts w:ascii="Arial" w:eastAsia="Times New Roman" w:hAnsi="Arial" w:cs="Arial"/>
-          <w:color w:val="000000"/>
-          <w:kern w:val="0"/>
-          <w:sz w:val="22"/>
-          <w:szCs w:val="22"/>
-          <w:lang w:val="en-US"/>
-          <w14:ligatures w14:val="none"/>
-        </w:rPr>
-        <w:t xml:space="preserve">: </w:t>
-      </w:r>
-      <w:hyperlink r:id="rId15" w:history="1">
-        <w:r>
-          <w:rPr>
-            <w:rStyle w:val="Hyperlink"/>
-            <w:rFonts w:ascii="Arial" w:eastAsia="Times New Roman" w:hAnsi="Arial" w:cs="Arial"/>
-            <w:kern w:val="0"/>
-            <w:sz w:val="22"/>
-            <w:szCs w:val="22"/>
-            <w:lang w:val="en-US"/>
-            <w14:ligatures w14:val="none"/>
-          </w:rPr>
-          <w:t>Barcode Scan</w:t>
-        </w:r>
-      </w:hyperlink>
-    </w:p>
-    <w:p>
-      <w:pPr>
-        <w:numPr>
-          <w:ilvl w:val="0"/>
-          <w:numId w:val="8"/>
-        </w:numPr>
-        <w:spacing w:after="0" w:line="240" w:lineRule="auto"/>
-        <w:rPr>
-          <w:rFonts w:ascii="Arial" w:eastAsia="Times New Roman" w:hAnsi="Arial" w:cs="Arial"/>
-          <w:color w:val="000000"/>
-          <w:kern w:val="0"/>
-          <w:sz w:val="22"/>
-          <w:szCs w:val="22"/>
-          <w14:ligatures w14:val="none"/>
-        </w:rPr>
-      </w:pPr>
-      <w:r>
-        <w:rPr>
-          <w:rFonts w:ascii="Arial" w:eastAsia="Times New Roman" w:hAnsi="Arial" w:cs="Arial"/>
-          <w:color w:val="000000"/>
-          <w:kern w:val="0"/>
-          <w:sz w:val="22"/>
-          <w:szCs w:val="22"/>
-          <w14:ligatures w14:val="none"/>
-        </w:rPr>
-        <w:t>Developed an Android app in Kotlin to retrieve item details (price, quantity</w:t>
-      </w:r>
-      <w:r>
-        <w:rPr>
-          <w:rFonts w:ascii="Arial" w:eastAsia="Times New Roman" w:hAnsi="Arial" w:cs="Arial"/>
-          <w:color w:val="000000"/>
-          <w:kern w:val="0"/>
-          <w:sz w:val="22"/>
-          <w:szCs w:val="22"/>
-          <w14:ligatures w14:val="none"/>
-        </w:rPr>
-        <w:t xml:space="preserve">, </w:t>
-      </w:r>
-      <w:r>
-        <w:rPr>
-          <w:rFonts w:ascii="Arial" w:eastAsia="Times New Roman" w:hAnsi="Arial" w:cs="Arial"/>
-          <w:color w:val="000000"/>
-          <w:kern w:val="0"/>
-          <w:sz w:val="22"/>
-          <w:szCs w:val="22"/>
-          <w14:ligatures w14:val="none"/>
-        </w:rPr>
-        <w:t>etc</w:t>
-      </w:r>
-      <w:r>
-        <w:rPr>
-          <w:rFonts w:ascii="Arial" w:eastAsia="Times New Roman" w:hAnsi="Arial" w:cs="Arial"/>
-          <w:color w:val="000000"/>
-          <w:kern w:val="0"/>
-          <w:sz w:val="22"/>
-          <w:szCs w:val="22"/>
+        <w:t>developed a heap supporting efficient merges and key updates</w:t>
+      </w:r>
+      <w:r>
+        <w:rPr>
+          <w:rFonts w:ascii="Arial" w:eastAsia="Times New Roman" w:hAnsi="Arial" w:cs="Arial"/>
+          <w:color w:val="000000"/>
+          <w:kern w:val="0"/>
+          <w:sz w:val="22"/>
+          <w:szCs w:val="22"/>
+          <w:lang w:val="en-US"/>
           <w14:ligatures w14:val="none"/>
         </w:rPr>
         <w:t>.</w:t>
       </w:r>
-      <w:r>
-        <w:rPr>
-          <w:rFonts w:ascii="Arial" w:eastAsia="Times New Roman" w:hAnsi="Arial" w:cs="Arial"/>
-          <w:color w:val="000000"/>
-          <w:kern w:val="0"/>
-          <w:sz w:val="22"/>
-          <w:szCs w:val="22"/>
-          <w14:ligatures w14:val="none"/>
-        </w:rPr>
-        <w:t>) via barcode scanning or manual search.</w:t>
-      </w:r>
-    </w:p>
-    <w:p>
-      <w:pPr>
-        <w:numPr>
-          <w:ilvl w:val="0"/>
-          <w:numId w:val="8"/>
-        </w:numPr>
-        <w:spacing w:after="0" w:line="240" w:lineRule="auto"/>
-        <w:rPr>
-          <w:rFonts w:ascii="Arial" w:eastAsia="Times New Roman" w:hAnsi="Arial" w:cs="Arial"/>
-          <w:color w:val="000000"/>
-          <w:kern w:val="0"/>
-          <w:sz w:val="22"/>
-          <w:szCs w:val="22"/>
-          <w14:ligatures w14:val="none"/>
-        </w:rPr>
-      </w:pPr>
-      <w:r>
-        <w:rPr>
-          <w:rFonts w:ascii="Arial" w:eastAsia="Times New Roman" w:hAnsi="Arial" w:cs="Arial"/>
-          <w:color w:val="000000"/>
-          <w:kern w:val="0"/>
-          <w:sz w:val="22"/>
-          <w:szCs w:val="22"/>
-          <w14:ligatures w14:val="none"/>
-        </w:rPr>
-        <w:t>Boosted employee productivity (~20% faster in receiving new goods).</w:t>
-      </w:r>
-    </w:p>
-    <w:p>
-      <w:pPr>
-        <w:numPr>
-          <w:ilvl w:val="0"/>
-          <w:numId w:val="8"/>
-        </w:numPr>
-        <w:spacing w:after="0" w:line="240" w:lineRule="auto"/>
-        <w:rPr>
-          <w:rFonts w:ascii="Arial" w:eastAsia="Times New Roman" w:hAnsi="Arial" w:cs="Arial"/>
-          <w:color w:val="000000"/>
-          <w:kern w:val="0"/>
-          <w:sz w:val="22"/>
-          <w:szCs w:val="22"/>
-          <w14:ligatures w14:val="none"/>
-        </w:rPr>
-      </w:pPr>
-      <w:r>
-        <w:rPr>
-          <w:rFonts w:ascii="Arial" w:eastAsia="Times New Roman" w:hAnsi="Arial" w:cs="Arial"/>
-          <w:color w:val="000000"/>
-          <w:kern w:val="0"/>
-          <w:sz w:val="22"/>
-          <w:szCs w:val="22"/>
-          <w14:ligatures w14:val="none"/>
-        </w:rPr>
-        <w:t>Integrated with Firebase for cloud sync and Room for local data storage.</w:t>
-      </w:r>
-    </w:p>
-    <w:p>
-      <w:pPr>
-        <w:spacing w:after="0" w:line="240" w:lineRule="auto"/>
-        <w:rPr>
-          <w:rFonts w:ascii="Arial" w:eastAsia="Times New Roman" w:hAnsi="Arial" w:cs="Arial"/>
-          <w:color w:val="000000"/>
-          <w:kern w:val="0"/>
-          <w:sz w:val="22"/>
-          <w:szCs w:val="22"/>
-          <w14:ligatures w14:val="none"/>
-        </w:rPr>
-      </w:pPr>
     </w:p>
     <w:p>
       <w:pPr>
@@ -2877,13 +3253,65 @@
         </w:rPr>
         <w:t>Managed purchasing and inventory using ERP systems: supplier orders, pricing, and stock tracking.</w:t>
       </w:r>
+      <w:r>
+        <w:rPr>
+          <w:rFonts w:ascii="Arial" w:eastAsia="Times New Roman" w:hAnsi="Arial" w:cs="Arial"/>
+          <w:color w:val="000000"/>
+          <w:kern w:val="0"/>
+          <w:sz w:val="22"/>
+          <w:szCs w:val="22"/>
+          <w:lang w:val="en-US"/>
+          <w14:ligatures w14:val="none"/>
+        </w:rPr>
+        <w:t xml:space="preserve"> </w:t>
+      </w:r>
+      <w:r>
+        <w:rPr>
+          <w:rFonts w:ascii="Arial" w:eastAsia="Times New Roman" w:hAnsi="Arial" w:cs="Arial"/>
+          <w:color w:val="000000"/>
+          <w:kern w:val="0"/>
+          <w:sz w:val="22"/>
+          <w:szCs w:val="22"/>
+          <w14:ligatures w14:val="none"/>
+        </w:rPr>
+        <w:t>Supported creation and maintenance of an e-commerce platform</w:t>
+      </w:r>
+      <w:r>
+        <w:rPr>
+          <w:rFonts w:ascii="Arial" w:eastAsia="Times New Roman" w:hAnsi="Arial" w:cs="Arial"/>
+          <w:color w:val="000000"/>
+          <w:kern w:val="0"/>
+          <w:sz w:val="22"/>
+          <w:szCs w:val="22"/>
+          <w14:ligatures w14:val="none"/>
+        </w:rPr>
+        <w:t xml:space="preserve"> (</w:t>
+      </w:r>
+      <w:r>
+        <w:rPr>
+          <w:rFonts w:ascii="Arial" w:eastAsia="Times New Roman" w:hAnsi="Arial" w:cs="Arial"/>
+          <w:color w:val="000000"/>
+          <w:kern w:val="0"/>
+          <w:sz w:val="22"/>
+          <w:szCs w:val="22"/>
+          <w14:ligatures w14:val="none"/>
+        </w:rPr>
+        <w:t>Shopify based)</w:t>
+      </w:r>
+      <w:r>
+        <w:rPr>
+          <w:rFonts w:ascii="Arial" w:eastAsia="Times New Roman" w:hAnsi="Arial" w:cs="Arial"/>
+          <w:color w:val="000000"/>
+          <w:kern w:val="0"/>
+          <w:sz w:val="22"/>
+          <w:szCs w:val="22"/>
+          <w14:ligatures w14:val="none"/>
+        </w:rPr>
+        <w:t>.</w:t>
+      </w:r>
     </w:p>
     <w:p>
       <w:pPr>
-        <w:numPr>
-          <w:ilvl w:val="0"/>
-          <w:numId w:val="7"/>
-        </w:numPr>
         <w:spacing w:after="0" w:line="240" w:lineRule="auto"/>
         <w:rPr>
           <w:rFonts w:ascii="Arial" w:eastAsia="Times New Roman" w:hAnsi="Arial" w:cs="Arial"/>
@@ -2891,84 +3319,25 @@
           <w:kern w:val="0"/>
           <w:sz w:val="22"/>
           <w:szCs w:val="22"/>
-          <w14:ligatures w14:val="none"/>
-        </w:rPr>
-      </w:pPr>
-      <w:r>
-        <w:rPr>
-          <w:rFonts w:ascii="Arial" w:eastAsia="Times New Roman" w:hAnsi="Arial" w:cs="Arial"/>
-          <w:color w:val="000000"/>
-          <w:kern w:val="0"/>
-          <w:sz w:val="22"/>
-          <w:szCs w:val="22"/>
-          <w14:ligatures w14:val="none"/>
-        </w:rPr>
-        <w:t>Developed an Android inventory management app (see Projects).</w:t>
+          <w:u w:val="single"/>
+          <w14:ligatures w14:val="none"/>
+        </w:rPr>
+      </w:pPr>
+      <w:r>
+        <w:rPr>
+          <w:rFonts w:ascii="Arial" w:eastAsia="Times New Roman" w:hAnsi="Arial" w:cs="Arial"/>
+          <w:color w:val="000000"/>
+          <w:kern w:val="0"/>
+          <w:sz w:val="22"/>
+          <w:szCs w:val="22"/>
+          <w:u w:val="single"/>
+          <w14:ligatures w14:val="none"/>
+        </w:rPr>
+        <w:t>Volunteer</w:t>
       </w:r>
     </w:p>
     <w:p>
       <w:pPr>
-        <w:numPr>
-          <w:ilvl w:val="0"/>
-          <w:numId w:val="7"/>
-        </w:numPr>
-        <w:spacing w:line="240" w:lineRule="auto"/>
-        <w:rPr>
-          <w:rFonts w:ascii="Arial" w:eastAsia="Times New Roman" w:hAnsi="Arial" w:cs="Arial"/>
-          <w:color w:val="000000"/>
-          <w:kern w:val="0"/>
-          <w:sz w:val="22"/>
-          <w:szCs w:val="22"/>
-          <w14:ligatures w14:val="none"/>
-        </w:rPr>
-      </w:pPr>
-      <w:r>
-        <w:rPr>
-          <w:rFonts w:ascii="Arial" w:eastAsia="Times New Roman" w:hAnsi="Arial" w:cs="Arial"/>
-          <w:color w:val="000000"/>
-          <w:kern w:val="0"/>
-          <w:sz w:val="22"/>
-          <w:szCs w:val="22"/>
-          <w14:ligatures w14:val="none"/>
-        </w:rPr>
-        <w:t>Supported creation and maintenance of an e-commerce platform</w:t>
-      </w:r>
-      <w:r>
-        <w:rPr>
-          <w:rFonts w:ascii="Arial" w:eastAsia="Times New Roman" w:hAnsi="Arial" w:cs="Arial"/>
-          <w:color w:val="000000"/>
-          <w:kern w:val="0"/>
-          <w:sz w:val="22"/>
-          <w:szCs w:val="22"/>
-          <w14:ligatures w14:val="none"/>
-        </w:rPr>
-        <w:t xml:space="preserve"> (</w:t>
-      </w:r>
-      <w:r>
-        <w:rPr>
-          <w:rFonts w:ascii="Arial" w:eastAsia="Times New Roman" w:hAnsi="Arial" w:cs="Arial"/>
-          <w:color w:val="000000"/>
-          <w:kern w:val="0"/>
-          <w:sz w:val="22"/>
-          <w:szCs w:val="22"/>
-          <w14:ligatures w14:val="none"/>
-        </w:rPr>
-        <w:t>Shopify based)</w:t>
-      </w:r>
-      <w:r>
-        <w:rPr>
-          <w:rFonts w:ascii="Arial" w:eastAsia="Times New Roman" w:hAnsi="Arial" w:cs="Arial"/>
-          <w:color w:val="000000"/>
-          <w:kern w:val="0"/>
-          <w:sz w:val="22"/>
-          <w:szCs w:val="22"/>
-          <w14:ligatures w14:val="none"/>
-        </w:rPr>
-        <w:t>.</w:t>
-      </w:r>
-    </w:p>
-    <w:p>
-      <w:pPr>
         <w:spacing w:after="0" w:line="240" w:lineRule="auto"/>
         <w:rPr>
           <w:rFonts w:ascii="Arial" w:eastAsia="Times New Roman" w:hAnsi="Arial" w:cs="Arial"/>
@@ -2976,32 +3345,6 @@
           <w:kern w:val="0"/>
           <w:sz w:val="22"/>
           <w:szCs w:val="22"/>
-          <w:u w:val="single"/>
-          <w14:ligatures w14:val="none"/>
-        </w:rPr>
-      </w:pPr>
-      <w:r>
-        <w:rPr>
-          <w:rFonts w:ascii="Arial" w:eastAsia="Times New Roman" w:hAnsi="Arial" w:cs="Arial"/>
-          <w:color w:val="000000"/>
-          <w:kern w:val="0"/>
-          <w:sz w:val="22"/>
-          <w:szCs w:val="22"/>
-          <w:u w:val="single"/>
-          <w14:ligatures w14:val="none"/>
-        </w:rPr>
-        <w:t>Volunteer</w:t>
-      </w:r>
-    </w:p>
-    <w:p>
-      <w:pPr>
-        <w:spacing w:after="0" w:line="240" w:lineRule="auto"/>
-        <w:rPr>
-          <w:rFonts w:ascii="Arial" w:eastAsia="Times New Roman" w:hAnsi="Arial" w:cs="Arial"/>
-          <w:color w:val="000000"/>
-          <w:kern w:val="0"/>
-          <w:sz w:val="22"/>
-          <w:szCs w:val="22"/>
           <w14:ligatures w14:val="none"/>
         </w:rPr>
       </w:pPr>
@@ -3023,10 +3366,56 @@
           <w:kern w:val="0"/>
           <w:sz w:val="22"/>
           <w:szCs w:val="22"/>
-          <w14:ligatures w14:val="none"/>
-        </w:rPr>
-        <w:br/>
-        <w:t>Hillel Organization | Tel Aviv</w:t>
+          <w:lang w:val="en-US"/>
+          <w14:ligatures w14:val="none"/>
+        </w:rPr>
+        <w:t xml:space="preserve"> </w:t>
+      </w:r>
+      <w:r>
+        <w:rPr>
+          <w:rFonts w:ascii="Arial" w:eastAsia="Times New Roman" w:hAnsi="Arial" w:cs="Arial"/>
+          <w:color w:val="000000"/>
+          <w:kern w:val="0"/>
+          <w:sz w:val="22"/>
+          <w:szCs w:val="22"/>
+          <w:lang w:val="en-US"/>
+          <w14:ligatures w14:val="none"/>
+        </w:rPr>
+        <w:t xml:space="preserve">| </w:t>
+      </w:r>
+      <w:r>
+        <w:rPr>
+          <w:rFonts w:ascii="Arial" w:eastAsia="Times New Roman" w:hAnsi="Arial" w:cs="Arial"/>
+          <w:color w:val="000000"/>
+          <w:kern w:val="0"/>
+          <w:sz w:val="22"/>
+          <w:szCs w:val="22"/>
+          <w14:ligatures w14:val="none"/>
+        </w:rPr>
+        <w:t xml:space="preserve">Hillel Organization </w:t>
+      </w:r>
+      <w:r>
+        <w:rPr>
+          <w:rFonts w:ascii="Arial" w:eastAsia="Times New Roman" w:hAnsi="Arial" w:cs="Arial"/>
+          <w:color w:val="000000"/>
+          <w:kern w:val="0"/>
+          <w:sz w:val="22"/>
+          <w:szCs w:val="22"/>
+          <w:lang w:val="en-US"/>
+          <w14:ligatures w14:val="none"/>
+        </w:rPr>
+        <w:t>-</w:t>
+      </w:r>
+      <w:r>
+        <w:rPr>
+          <w:rFonts w:ascii="Arial" w:eastAsia="Times New Roman" w:hAnsi="Arial" w:cs="Arial"/>
+          <w:color w:val="000000"/>
+          <w:kern w:val="0"/>
+          <w:sz w:val="22"/>
+          <w:szCs w:val="22"/>
+          <w14:ligatures w14:val="none"/>
+        </w:rPr>
+        <w:t xml:space="preserve"> Tel Aviv</w:t>
       </w:r>
     </w:p>
     <w:p>
@@ -3059,7 +3448,7 @@
     </w:p>
     <w:p>
       <w:pPr>
-        <w:spacing w:line="240" w:lineRule="auto"/>
+        <w:spacing w:after="0" w:line="240" w:lineRule="auto"/>
         <w:rPr>
           <w:rFonts w:ascii="Arial" w:eastAsia="Times New Roman" w:hAnsi="Arial" w:cs="Arial"/>
           <w:color w:val="000000"/>
@@ -3067,6 +3456,7 @@
           <w:sz w:val="22"/>
           <w:szCs w:val="22"/>
           <w:u w:val="single"/>
+          <w:lang w:val="en-US"/>
           <w14:ligatures w14:val="none"/>
         </w:rPr>
       </w:pPr>
@@ -3107,16 +3497,15 @@
     </w:p>
     <w:p>
       <w:pPr>
-        <w:spacing w:after="0" w:line="240" w:lineRule="auto"/>
-        <w:textAlignment w:val="baseline"/>
-        <w:rPr>
-          <w:rFonts w:ascii="Arial" w:eastAsia="Times New Roman" w:hAnsi="Arial" w:cs="Arial"/>
-          <w:color w:val="000000"/>
-          <w:kern w:val="0"/>
-          <w:sz w:val="22"/>
-          <w:szCs w:val="22"/>
+        <w:spacing w:line="240" w:lineRule="auto"/>
+        <w:rPr>
+          <w:rFonts w:ascii="Arial" w:eastAsia="Times New Roman" w:hAnsi="Arial" w:cs="Arial"/>
+          <w:color w:val="000000"/>
+          <w:kern w:val="0"/>
+          <w:sz w:val="22"/>
+          <w:szCs w:val="22"/>
+          <w:u w:val="single"/>
           <w:rtl/>
-          <w:lang w:val="en-US"/>
           <w14:ligatures w14:val="none"/>
         </w:rPr>
       </w:pPr>
@@ -3139,6 +3528,7 @@
           <w:kern w:val="0"/>
           <w:sz w:val="22"/>
           <w:szCs w:val="22"/>
+          <w:lang w:val="en-US"/>
           <w14:ligatures w14:val="none"/>
         </w:rPr>
         <w:t xml:space="preserve"> </w:t>
@@ -3179,7 +3569,7 @@
     </w:p>
     <w:sectPr>
       <w:pgSz w:w="11906" w:h="16838" w:code="9"/>
-      <w:pgMar w:top="562" w:right="1152" w:bottom="432" w:left="1152" w:header="0" w:footer="0" w:gutter="0"/>
+      <w:pgMar w:top="562" w:right="720" w:bottom="432" w:left="720" w:header="0" w:footer="0" w:gutter="0"/>
       <w:cols w:space="708"/>
       <w:docGrid w:linePitch="360"/>
     </w:sectPr>
@@ -3538,6 +3928,155 @@
     </w:lvl>
   </w:abstractNum>
   <w:abstractNum w:abstractNumId="2" w15:restartNumberingAfterBreak="0">
+    <w:nsid w:val="13460B20"/>
+    <w:multiLevelType w:val="multilevel"/>
+    <w:tmpl w:val="E1482AC4"/>
+    <w:lvl w:ilvl="0">
+      <w:start w:val="1"/>
+      <w:numFmt w:val="bullet"/>
+      <w:lvlText w:val=""/>
+      <w:lvlJc w:val="left"/>
+      <w:pPr>
+        <w:tabs>
+          <w:tab w:val="num" w:pos="720"/>
+        </w:tabs>
+        <w:ind w:left="720" w:hanging="360"/>
+      </w:pPr>
+      <w:rPr>
+        <w:rFonts w:ascii="Symbol" w:hAnsi="Symbol" w:hint="default"/>
+        <w:sz w:val="20"/>
+      </w:rPr>
+    </w:lvl>
+    <w:lvl w:ilvl="1" w:tentative="1">
+      <w:start w:val="1"/>
+      <w:numFmt w:val="bullet"/>
+      <w:lvlText w:val="o"/>
+      <w:lvlJc w:val="left"/>
+      <w:pPr>
+        <w:tabs>
+          <w:tab w:val="num" w:pos="1440"/>
+        </w:tabs>
+        <w:ind w:left="1440" w:hanging="360"/>
+      </w:pPr>
+      <w:rPr>
+        <w:rFonts w:ascii="Courier New" w:hAnsi="Courier New" w:hint="default"/>
+        <w:sz w:val="20"/>
+      </w:rPr>
+    </w:lvl>
+    <w:lvl w:ilvl="2" w:tentative="1">
+      <w:start w:val="1"/>
+      <w:numFmt w:val="bullet"/>
+      <w:lvlText w:val=""/>
+      <w:lvlJc w:val="left"/>
+      <w:pPr>
+        <w:tabs>
+          <w:tab w:val="num" w:pos="2160"/>
+        </w:tabs>
+        <w:ind w:left="2160" w:hanging="360"/>
+      </w:pPr>
+      <w:rPr>
+        <w:rFonts w:ascii="Wingdings" w:hAnsi="Wingdings" w:hint="default"/>
+        <w:sz w:val="20"/>
+      </w:rPr>
+    </w:lvl>
+    <w:lvl w:ilvl="3" w:tentative="1">
+      <w:start w:val="1"/>
+      <w:numFmt w:val="bullet"/>
+      <w:lvlText w:val=""/>
+      <w:lvlJc w:val="left"/>
+      <w:pPr>
+        <w:tabs>
+          <w:tab w:val="num" w:pos="2880"/>
+        </w:tabs>
+        <w:ind w:left="2880" w:hanging="360"/>
+      </w:pPr>
+      <w:rPr>
+        <w:rFonts w:ascii="Wingdings" w:hAnsi="Wingdings" w:hint="default"/>
+        <w:sz w:val="20"/>
+      </w:rPr>
+    </w:lvl>
+    <w:lvl w:ilvl="4" w:tentative="1">
+      <w:start w:val="1"/>
+      <w:numFmt w:val="bullet"/>
+      <w:lvlText w:val=""/>
+      <w:lvlJc w:val="left"/>
+      <w:pPr>
+        <w:tabs>
+          <w:tab w:val="num" w:pos="3600"/>
+        </w:tabs>
+        <w:ind w:left="3600" w:hanging="360"/>
+      </w:pPr>
+      <w:rPr>
+        <w:rFonts w:ascii="Wingdings" w:hAnsi="Wingdings" w:hint="default"/>
+        <w:sz w:val="20"/>
+      </w:rPr>
+    </w:lvl>
+    <w:lvl w:ilvl="5" w:tentative="1">
+      <w:start w:val="1"/>
+      <w:numFmt w:val="bullet"/>
+      <w:lvlText w:val=""/>
+      <w:lvlJc w:val="left"/>
+      <w:pPr>
+        <w:tabs>
+          <w:tab w:val="num" w:pos="4320"/>
+        </w:tabs>
+        <w:ind w:left="4320" w:hanging="360"/>
+      </w:pPr>
+      <w:rPr>
+        <w:rFonts w:ascii="Wingdings" w:hAnsi="Wingdings" w:hint="default"/>
+        <w:sz w:val="20"/>
+      </w:rPr>
+    </w:lvl>
+    <w:lvl w:ilvl="6" w:tentative="1">
+      <w:start w:val="1"/>
+      <w:numFmt w:val="bullet"/>
+      <w:lvlText w:val=""/>
+      <w:lvlJc w:val="left"/>
+      <w:pPr>
+        <w:tabs>
+          <w:tab w:val="num" w:pos="5040"/>
+        </w:tabs>
+        <w:ind w:left="5040" w:hanging="360"/>
+      </w:pPr>
+      <w:rPr>
+        <w:rFonts w:ascii="Wingdings" w:hAnsi="Wingdings" w:hint="default"/>
+        <w:sz w:val="20"/>
+      </w:rPr>
+    </w:lvl>
+    <w:lvl w:ilvl="7" w:tentative="1">
+      <w:start w:val="1"/>
+      <w:numFmt w:val="bullet"/>
+      <w:lvlText w:val=""/>
+      <w:lvlJc w:val="left"/>
+      <w:pPr>
+        <w:tabs>
+          <w:tab w:val="num" w:pos="5760"/>
+        </w:tabs>
+        <w:ind w:left="5760" w:hanging="360"/>
+      </w:pPr>
+      <w:rPr>
+        <w:rFonts w:ascii="Wingdings" w:hAnsi="Wingdings" w:hint="default"/>
+        <w:sz w:val="20"/>
+      </w:rPr>
+    </w:lvl>
+    <w:lvl w:ilvl="8" w:tentative="1">
+      <w:start w:val="1"/>
+      <w:numFmt w:val="bullet"/>
+      <w:lvlText w:val=""/>
+      <w:lvlJc w:val="left"/>
+      <w:pPr>
+        <w:tabs>
+          <w:tab w:val="num" w:pos="6480"/>
+        </w:tabs>
+        <w:ind w:left="6480" w:hanging="360"/>
+      </w:pPr>
+      <w:rPr>
+        <w:rFonts w:ascii="Wingdings" w:hAnsi="Wingdings" w:hint="default"/>
+        <w:sz w:val="20"/>
+      </w:rPr>
+    </w:lvl>
+  </w:abstractNum>
+  <w:abstractNum w:abstractNumId="3" w15:restartNumberingAfterBreak="0">
     <w:nsid w:val="26AE13A0"/>
     <w:multiLevelType w:val="hybridMultilevel"/>
     <w:tmpl w:val="38A450C0"/>
@@ -3650,7 +4189,7 @@
       </w:rPr>
     </w:lvl>
   </w:abstractNum>
-  <w:abstractNum w:abstractNumId="3" w15:restartNumberingAfterBreak="0">
+  <w:abstractNum w:abstractNumId="4" w15:restartNumberingAfterBreak="0">
     <w:nsid w:val="2D8C02EC"/>
     <w:multiLevelType w:val="multilevel"/>
     <w:tmpl w:val="A26C9354"/>
@@ -3799,7 +4338,7 @@
       </w:rPr>
     </w:lvl>
   </w:abstractNum>
-  <w:abstractNum w:abstractNumId="4" w15:restartNumberingAfterBreak="0">
+  <w:abstractNum w:abstractNumId="5" w15:restartNumberingAfterBreak="0">
     <w:nsid w:val="32E24EED"/>
     <w:multiLevelType w:val="hybridMultilevel"/>
     <w:tmpl w:val="7C344C5E"/>
@@ -3912,7 +4451,7 @@
       </w:rPr>
     </w:lvl>
   </w:abstractNum>
-  <w:abstractNum w:abstractNumId="5" w15:restartNumberingAfterBreak="0">
+  <w:abstractNum w:abstractNumId="6" w15:restartNumberingAfterBreak="0">
     <w:nsid w:val="3EF21BE3"/>
     <w:multiLevelType w:val="multilevel"/>
     <w:tmpl w:val="27B6EF3A"/>
@@ -4061,7 +4600,7 @@
       </w:rPr>
     </w:lvl>
   </w:abstractNum>
-  <w:abstractNum w:abstractNumId="6" w15:restartNumberingAfterBreak="0">
+  <w:abstractNum w:abstractNumId="7" w15:restartNumberingAfterBreak="0">
     <w:nsid w:val="4C4F35AC"/>
     <w:multiLevelType w:val="hybridMultilevel"/>
     <w:tmpl w:val="E4FC2EFC"/>
@@ -4174,7 +4713,7 @@
       </w:rPr>
     </w:lvl>
   </w:abstractNum>
-  <w:abstractNum w:abstractNumId="7" w15:restartNumberingAfterBreak="0">
+  <w:abstractNum w:abstractNumId="8" w15:restartNumberingAfterBreak="0">
     <w:nsid w:val="575108E7"/>
     <w:multiLevelType w:val="multilevel"/>
     <w:tmpl w:val="78E0CE28"/>
@@ -4323,7 +4862,7 @@
       </w:rPr>
     </w:lvl>
   </w:abstractNum>
-  <w:abstractNum w:abstractNumId="8" w15:restartNumberingAfterBreak="0">
+  <w:abstractNum w:abstractNumId="9" w15:restartNumberingAfterBreak="0">
     <w:nsid w:val="594C099D"/>
     <w:multiLevelType w:val="multilevel"/>
     <w:tmpl w:val="F8709A54"/>
@@ -4472,7 +5011,7 @@
       </w:rPr>
     </w:lvl>
   </w:abstractNum>
-  <w:abstractNum w:abstractNumId="9" w15:restartNumberingAfterBreak="0">
+  <w:abstractNum w:abstractNumId="10" w15:restartNumberingAfterBreak="0">
     <w:nsid w:val="61E426E6"/>
     <w:multiLevelType w:val="multilevel"/>
     <w:tmpl w:val="24FA0B02"/>
@@ -4621,7 +5160,7 @@
       </w:rPr>
     </w:lvl>
   </w:abstractNum>
-  <w:abstractNum w:abstractNumId="10" w15:restartNumberingAfterBreak="0">
+  <w:abstractNum w:abstractNumId="11" w15:restartNumberingAfterBreak="0">
     <w:nsid w:val="785F19EB"/>
     <w:multiLevelType w:val="multilevel"/>
     <w:tmpl w:val="14EE503C"/>
@@ -4770,7 +5309,7 @@
       </w:rPr>
     </w:lvl>
   </w:abstractNum>
-  <w:abstractNum w:abstractNumId="11" w15:restartNumberingAfterBreak="0">
+  <w:abstractNum w:abstractNumId="12" w15:restartNumberingAfterBreak="0">
     <w:nsid w:val="79B328C7"/>
     <w:multiLevelType w:val="hybridMultilevel"/>
     <w:tmpl w:val="10EC7C46"/>
@@ -4887,37 +5426,40 @@
     <w:abstractNumId w:val="1"/>
   </w:num>
   <w:num w:numId="2" w16cid:durableId="187835374">
-    <w:abstractNumId w:val="8"/>
+    <w:abstractNumId w:val="9"/>
   </w:num>
   <w:num w:numId="3" w16cid:durableId="1202521661">
-    <w:abstractNumId w:val="3"/>
+    <w:abstractNumId w:val="4"/>
   </w:num>
   <w:num w:numId="4" w16cid:durableId="1037044052">
-    <w:abstractNumId w:val="10"/>
+    <w:abstractNumId w:val="11"/>
   </w:num>
   <w:num w:numId="5" w16cid:durableId="1005520194">
-    <w:abstractNumId w:val="7"/>
+    <w:abstractNumId w:val="8"/>
   </w:num>
   <w:num w:numId="6" w16cid:durableId="1052311766">
     <w:abstractNumId w:val="0"/>
   </w:num>
   <w:num w:numId="7" w16cid:durableId="1482304101">
-    <w:abstractNumId w:val="9"/>
+    <w:abstractNumId w:val="10"/>
   </w:num>
   <w:num w:numId="8" w16cid:durableId="269289179">
+    <w:abstractNumId w:val="6"/>
+  </w:num>
+  <w:num w:numId="9" w16cid:durableId="615675124">
+    <w:abstractNumId w:val="12"/>
+  </w:num>
+  <w:num w:numId="10" w16cid:durableId="56439418">
+    <w:abstractNumId w:val="3"/>
+  </w:num>
+  <w:num w:numId="11" w16cid:durableId="1864436127">
+    <w:abstractNumId w:val="7"/>
+  </w:num>
+  <w:num w:numId="12" w16cid:durableId="533929272">
     <w:abstractNumId w:val="5"/>
   </w:num>
-  <w:num w:numId="9" w16cid:durableId="615675124">
-    <w:abstractNumId w:val="11"/>
-  </w:num>
-  <w:num w:numId="10" w16cid:durableId="56439418">
+  <w:num w:numId="13" w16cid:durableId="2067029331">
     <w:abstractNumId w:val="2"/>
-  </w:num>
-  <w:num w:numId="11" w16cid:durableId="1864436127">
-    <w:abstractNumId w:val="6"/>
-  </w:num>
-  <w:num w:numId="12" w16cid:durableId="533929272">
-    <w:abstractNumId w:val="4"/>
   </w:num>
 </w:numbering>
 </file>

</xml_diff>